<commit_message>
feat: implementar generación de certificados de anuncios en formato PDF
Se ha integrado la funcionalidad para generar y visualizar certificados de anuncios directamente en formato PDF utilizando LibreOffice para la conversión desde plantillas Word (.docx).

- CertificadoAnuncioService: Actualización para conversión DOCX a PDF mediante OfficeConverter. Formateo de fechas en español (dd de Mes de YYYY) y carga de datos de la licencia asociada.

- AnuncioPdfController: Nuevo controlador para gestionar la generación y entrega del archivo PDF de forma inline.

- Interfaz de Usuario: Modificación de la acción Generar Certificado en AnunciosTable para abrir el PDF en una nueva pestaña.

- Configuración y Rutas: Añadido binario de LibreOffice en config/services.php y registro de nueva ruta en web.php.

- Detalles técnicos: Implementación de perfil temporal de LibreOffice para permisos y limpieza automática de archivos temporales.
</commit_message>
<xml_diff>
--- a/app/Filament/Clusters/Sil/Resources/Anuncios/Template/template_carton_anuncio.docx
+++ b/app/Filament/Clusters/Sil/Resources/Anuncios/Template/template_carton_anuncio.docx
@@ -1393,15 +1393,16 @@
         <w:ind w:left="828"/>
         <w:rPr>
           <w:rFonts w:ascii="Arial MT" w:hAnsi="Arial MT"/>
-          <w:sz w:val="18"/>
-        </w:rPr>
-      </w:pPr>
-      <w:r>
-        <w:rPr>
-          <w:rFonts w:ascii="Arial MT" w:hAnsi="Arial MT"/>
           <w:spacing w:val="-4"/>
           <w:sz w:val="18"/>
         </w:rPr>
+      </w:pPr>
+      <w:r>
+        <w:rPr>
+          <w:rFonts w:ascii="Arial MT" w:hAnsi="Arial MT"/>
+          <w:spacing w:val="-4"/>
+          <w:sz w:val="18"/>
+        </w:rPr>
         <w:t>La</w:t>
       </w:r>
       <w:r>
@@ -1644,6 +1645,87 @@
         </w:rPr>
         <w:t>administrado.</w:t>
       </w:r>
+    </w:p>
+    <w:p>
+      <w:pPr>
+        <w:spacing w:before="1"/>
+        <w:ind w:left="828"/>
+        <w:rPr>
+          <w:rFonts w:ascii="Arial MT" w:hAnsi="Arial MT"/>
+          <w:sz w:val="18"/>
+        </w:rPr>
+      </w:pPr>
+      <w:r>
+        <w:rPr>
+          <w:rFonts w:ascii="Arial MT" w:hAnsi="Arial MT"/>
+          <w:sz w:val="18"/>
+        </w:rPr>
+        <w:t xml:space="preserve">La presente autorización estará sujeta a la Licencia de Funcionamiento </w:t>
+      </w:r>
+      <w:proofErr w:type="spellStart"/>
+      <w:r>
+        <w:rPr>
+          <w:rFonts w:ascii="Arial MT" w:hAnsi="Arial MT"/>
+          <w:b/>
+          <w:bCs/>
+          <w:sz w:val="18"/>
+        </w:rPr>
+        <w:t>N</w:t>
+      </w:r>
+      <w:r>
+        <w:rPr>
+          <w:rFonts w:ascii="Arial MT" w:hAnsi="Arial MT"/>
+          <w:b/>
+          <w:bCs/>
+          <w:sz w:val="18"/>
+        </w:rPr>
+        <w:t>°</w:t>
+      </w:r>
+      <w:proofErr w:type="spellEnd"/>
+      <w:r>
+        <w:rPr>
+          <w:rFonts w:ascii="Arial MT" w:hAnsi="Arial MT"/>
+          <w:b/>
+          <w:bCs/>
+          <w:sz w:val="18"/>
+        </w:rPr>
+        <w:t xml:space="preserve"> </w:t>
+      </w:r>
+      <w:r>
+        <w:rPr>
+          <w:rFonts w:ascii="Arial MT" w:hAnsi="Arial MT"/>
+          <w:b/>
+          <w:bCs/>
+          <w:sz w:val="18"/>
+        </w:rPr>
+        <w:t>${LICENCIA_DE_F}-${LICENCIA_ANIO}</w:t>
+      </w:r>
+      <w:r>
+        <w:rPr>
+          <w:rFonts w:ascii="Arial MT" w:hAnsi="Arial MT"/>
+          <w:sz w:val="18"/>
+        </w:rPr>
+        <w:t xml:space="preserve">, de vigencia </w:t>
+      </w:r>
+      <w:r>
+        <w:rPr>
+          <w:rFonts w:ascii="Arial Narrow" w:hAnsi="Arial Narrow"/>
+          <w:b/>
+          <w:sz w:val="20"/>
+          <w:szCs w:val="20"/>
+        </w:rPr>
+        <w:t>${VIGENCIA}</w:t>
+      </w:r>
+    </w:p>
+    <w:p>
+      <w:pPr>
+        <w:spacing w:before="1"/>
+        <w:ind w:left="828"/>
+        <w:rPr>
+          <w:rFonts w:ascii="Arial MT" w:hAnsi="Arial MT"/>
+          <w:sz w:val="18"/>
+        </w:rPr>
+      </w:pPr>
     </w:p>
     <w:p>
       <w:pPr>
@@ -1679,6 +1761,7 @@
         <w:jc w:val="right"/>
         <w:rPr>
           <w:b/>
+          <w:spacing w:val="-3"/>
           <w:sz w:val="18"/>
         </w:rPr>
       </w:pPr>
@@ -1719,6 +1802,25 @@
           <w:sz w:val="18"/>
         </w:rPr>
         <w:t>${FECHA_RESOLUCION}</w:t>
+      </w:r>
+    </w:p>
+    <w:p>
+      <w:pPr>
+        <w:ind w:right="189"/>
+        <w:jc w:val="right"/>
+        <w:rPr>
+          <w:b/>
+          <w:sz w:val="18"/>
+          <w:lang w:val="es-PE"/>
+        </w:rPr>
+      </w:pPr>
+      <w:r>
+        <w:rPr>
+          <w:b/>
+          <w:spacing w:val="-3"/>
+          <w:sz w:val="18"/>
+        </w:rPr>
+        <w:t xml:space="preserve">    </w:t>
       </w:r>
     </w:p>
     <w:sectPr>
@@ -2154,7 +2256,6 @@
   <w:style w:type="character" w:default="1" w:styleId="Fuentedeprrafopredeter">
     <w:name w:val="Default Paragraph Font"/>
     <w:uiPriority w:val="1"/>
-    <w:semiHidden/>
     <w:unhideWhenUsed/>
   </w:style>
   <w:style w:type="table" w:default="1" w:styleId="Tablanormal">

</xml_diff>

<commit_message>
fix: ajuste de colores en el template
</commit_message>
<xml_diff>
--- a/app/Filament/Clusters/Sil/Resources/Anuncios/Template/template_carton_anuncio.docx
+++ b/app/Filament/Clusters/Sil/Resources/Anuncios/Template/template_carton_anuncio.docx
@@ -356,10 +356,7 @@
         <w:t>:</w:t>
       </w:r>
       <w:r>
-        <w:t xml:space="preserve"> </w:t>
-      </w:r>
-      <w:r>
-        <w:t>${DIRECCION_PREDIO}</w:t>
+        <w:t xml:space="preserve"> ${DIRECCION_PREDIO}</w:t>
       </w:r>
       <w:r>
         <w:br/>
@@ -462,9 +459,6 @@
       </w:r>
       <w:r>
         <w:tab/>
-      </w:r>
-      <w:proofErr w:type="gramStart"/>
-      <w:r>
         <w:t>CLASIFICACIÓN</w:t>
       </w:r>
       <w:r>
@@ -476,7 +470,6 @@
       <w:r>
         <w:t>:</w:t>
       </w:r>
-      <w:proofErr w:type="gramEnd"/>
       <w:r>
         <w:rPr>
           <w:spacing w:val="-8"/>
@@ -589,10 +582,7 @@
         <w:t>:</w:t>
       </w:r>
       <w:r>
-        <w:t xml:space="preserve"> </w:t>
-      </w:r>
-      <w:r>
-        <w:t>${UBICACIÓN_ANUNCIO}</w:t>
+        <w:t xml:space="preserve"> ${UBICACIÓN_ANUNCIO}</w:t>
       </w:r>
     </w:p>
     <w:p>
@@ -603,7 +593,7 @@
           <w:tab w:val="left" w:pos="6150"/>
         </w:tabs>
         <w:spacing w:before="182"/>
-        <w:ind w:left="408"/>
+        <w:ind w:left="5670" w:hanging="5262"/>
       </w:pPr>
       <w:proofErr w:type="spellStart"/>
       <w:r>
@@ -962,25 +952,7 @@
           <w:spacing w:val="-2"/>
           <w:sz w:val="18"/>
         </w:rPr>
-        <w:t>2682-</w:t>
-      </w:r>
-      <w:proofErr w:type="gramStart"/>
-      <w:r>
-        <w:rPr>
-          <w:rFonts w:ascii="Arial MT" w:hAnsi="Arial MT"/>
-          <w:spacing w:val="-2"/>
-          <w:sz w:val="18"/>
-        </w:rPr>
-        <w:t>MML,Ordenanza</w:t>
-      </w:r>
-      <w:proofErr w:type="gramEnd"/>
-      <w:r>
-        <w:rPr>
-          <w:rFonts w:ascii="Arial MT" w:hAnsi="Arial MT"/>
-          <w:spacing w:val="-2"/>
-          <w:sz w:val="18"/>
-        </w:rPr>
-        <w:t xml:space="preserve"> </w:t>
+        <w:t xml:space="preserve">2682-MML,Ordenanza </w:t>
       </w:r>
       <w:proofErr w:type="spellStart"/>
       <w:r>
@@ -1512,17 +1484,7 @@
           <w:bCs/>
           <w:sz w:val="18"/>
         </w:rPr>
-        <w:t xml:space="preserve"> ${LICENCIA_DE_F}-${LICENCIA_</w:t>
-      </w:r>
-      <w:proofErr w:type="gramStart"/>
-      <w:r>
-        <w:rPr>
-          <w:rFonts w:ascii="Arial MT" w:hAnsi="Arial MT"/>
-          <w:b/>
-          <w:bCs/>
-          <w:sz w:val="18"/>
-        </w:rPr>
-        <w:t>ANIO}</w:t>
+        <w:t xml:space="preserve"> ${LICENCIA_DE_F}-${LICENCIA_ANIO}</w:t>
       </w:r>
       <w:r>
         <w:rPr>
@@ -1531,17 +1493,7 @@
           <w:sz w:val="20"/>
           <w:szCs w:val="20"/>
         </w:rPr>
-        <w:t>$</w:t>
-      </w:r>
-      <w:proofErr w:type="gramEnd"/>
-      <w:r>
-        <w:rPr>
-          <w:rFonts w:ascii="Arial Narrow" w:hAnsi="Arial Narrow"/>
-          <w:b/>
-          <w:sz w:val="20"/>
-          <w:szCs w:val="20"/>
-        </w:rPr>
-        <w:t>{VIGENCIA</w:t>
+        <w:t>${VIGENCIA</w:t>
       </w:r>
       <w:r>
         <w:rPr>

</xml_diff>

<commit_message>
fix: se actualizo la plantilla para el word de anuncios
</commit_message>
<xml_diff>
--- a/app/Filament/Clusters/Sil/Resources/Anuncios/Template/template_carton_anuncio.docx
+++ b/app/Filament/Clusters/Sil/Resources/Anuncios/Template/template_carton_anuncio.docx
@@ -1,6 +1,6 @@
 
 <file path=word/document.xml><?xml version="1.0" encoding="utf-8"?>
-<w:document xmlns:wpc="http://schemas.microsoft.com/office/word/2010/wordprocessingCanvas" xmlns:cx="http://schemas.microsoft.com/office/drawing/2014/chartex" xmlns:cx1="http://schemas.microsoft.com/office/drawing/2015/9/8/chartex" xmlns:cx2="http://schemas.microsoft.com/office/drawing/2015/10/21/chartex" xmlns:cx3="http://schemas.microsoft.com/office/drawing/2016/5/9/chartex" xmlns:cx4="http://schemas.microsoft.com/office/drawing/2016/5/10/chartex" xmlns:cx5="http://schemas.microsoft.com/office/drawing/2016/5/11/chartex" xmlns:cx6="http://schemas.microsoft.com/office/drawing/2016/5/12/chartex" xmlns:cx7="http://schemas.microsoft.com/office/drawing/2016/5/13/chartex" xmlns:cx8="http://schemas.microsoft.com/office/drawing/2016/5/14/chartex" xmlns:mc="http://schemas.openxmlformats.org/markup-compatibility/2006" xmlns:aink="http://schemas.microsoft.com/office/drawing/2016/ink" xmlns:am3d="http://schemas.microsoft.com/office/drawing/2017/model3d" xmlns:o="urn:schemas-microsoft-com:office:office" xmlns:oel="http://schemas.microsoft.com/office/2019/extlst" xmlns:r="http://schemas.openxmlformats.org/officeDocument/2006/relationships" xmlns:m="http://schemas.openxmlformats.org/officeDocument/2006/math" xmlns:v="urn:schemas-microsoft-com:vml" xmlns:wp14="http://schemas.microsoft.com/office/word/2010/wordprocessingDrawing" xmlns:wp="http://schemas.openxmlformats.org/drawingml/2006/wordprocessingDrawing" xmlns:w10="urn:schemas-microsoft-com:office:word" xmlns:w="http://schemas.openxmlformats.org/wordprocessingml/2006/main" xmlns:w14="http://schemas.microsoft.com/office/word/2010/wordml" xmlns:w15="http://schemas.microsoft.com/office/word/2012/wordml" xmlns:w16cex="http://schemas.microsoft.com/office/word/2018/wordml/cex" xmlns:w16cid="http://schemas.microsoft.com/office/word/2016/wordml/cid" xmlns:w16="http://schemas.microsoft.com/office/word/2018/wordml" xmlns:w16du="http://schemas.microsoft.com/office/word/2023/wordml/word16du" xmlns:w16sdtdh="http://schemas.microsoft.com/office/word/2020/wordml/sdtdatahash" xmlns:w16sdtfl="http://schemas.microsoft.com/office/word/2024/wordml/sdtformatlock" xmlns:w16se="http://schemas.microsoft.com/office/word/2015/wordml/symex" xmlns:wpg="http://schemas.microsoft.com/office/word/2010/wordprocessingGroup" xmlns:wpi="http://schemas.microsoft.com/office/word/2010/wordprocessingInk" xmlns:wne="http://schemas.microsoft.com/office/word/2006/wordml" xmlns:wps="http://schemas.microsoft.com/office/word/2010/wordprocessingShape" mc:Ignorable="w14 w15 w16se w16cid w16 w16cex w16sdtdh w16sdtfl w16du wp14">
+<w:document xmlns:wpc="http://schemas.microsoft.com/office/word/2010/wordprocessingCanvas" xmlns:cx="http://schemas.microsoft.com/office/drawing/2014/chartex" xmlns:cx1="http://schemas.microsoft.com/office/drawing/2015/9/8/chartex" xmlns:cx2="http://schemas.microsoft.com/office/drawing/2015/10/21/chartex" xmlns:cx3="http://schemas.microsoft.com/office/drawing/2016/5/9/chartex" xmlns:cx4="http://schemas.microsoft.com/office/drawing/2016/5/10/chartex" xmlns:cx5="http://schemas.microsoft.com/office/drawing/2016/5/11/chartex" xmlns:cx6="http://schemas.microsoft.com/office/drawing/2016/5/12/chartex" xmlns:cx7="http://schemas.microsoft.com/office/drawing/2016/5/13/chartex" xmlns:cx8="http://schemas.microsoft.com/office/drawing/2016/5/14/chartex" xmlns:mc="http://schemas.openxmlformats.org/markup-compatibility/2006" xmlns:aink="http://schemas.microsoft.com/office/drawing/2016/ink" xmlns:am3d="http://schemas.microsoft.com/office/drawing/2017/model3d" xmlns:o="urn:schemas-microsoft-com:office:office" xmlns:oel="http://schemas.microsoft.com/office/2019/extlst" xmlns:r="http://schemas.openxmlformats.org/officeDocument/2006/relationships" xmlns:m="http://schemas.openxmlformats.org/officeDocument/2006/math" xmlns:v="urn:schemas-microsoft-com:vml" xmlns:wp14="http://schemas.microsoft.com/office/word/2010/wordprocessingDrawing" xmlns:wp="http://schemas.openxmlformats.org/drawingml/2006/wordprocessingDrawing" xmlns:w10="urn:schemas-microsoft-com:office:word" xmlns:w="http://schemas.openxmlformats.org/wordprocessingml/2006/main" xmlns:w14="http://schemas.microsoft.com/office/word/2010/wordml" xmlns:w15="http://schemas.microsoft.com/office/word/2012/wordml" xmlns:w16cex="http://schemas.microsoft.com/office/word/2018/wordml/cex" xmlns:w16cid="http://schemas.microsoft.com/office/word/2016/wordml/cid" xmlns:w16="http://schemas.microsoft.com/office/word/2018/wordml" xmlns:w16sdtdh="http://schemas.microsoft.com/office/word/2020/wordml/sdtdatahash" xmlns:w16se="http://schemas.microsoft.com/office/word/2015/wordml/symex" xmlns:wpg="http://schemas.microsoft.com/office/word/2010/wordprocessingGroup" xmlns:wpi="http://schemas.microsoft.com/office/word/2010/wordprocessingInk" xmlns:wne="http://schemas.microsoft.com/office/word/2006/wordml" xmlns:wps="http://schemas.microsoft.com/office/word/2010/wordprocessingShape" mc:Ignorable="w14 w15 w16se w16cid w16 w16cex w16sdtdh wp14">
   <w:body>
     <w:p>
       <w:pPr>
@@ -258,12 +258,10 @@
     <w:p>
       <w:pPr>
         <w:pStyle w:val="Textoindependiente"/>
-      </w:pPr>
-    </w:p>
-    <w:p>
-      <w:pPr>
-        <w:pStyle w:val="Textoindependiente"/>
         <w:spacing w:before="43"/>
+        <w:rPr>
+          <w:u w:val="single"/>
+        </w:rPr>
       </w:pPr>
     </w:p>
     <w:p>
@@ -459,6 +457,9 @@
       </w:r>
       <w:r>
         <w:tab/>
+      </w:r>
+      <w:proofErr w:type="gramStart"/>
+      <w:r>
         <w:t>CLASIFICACIÓN</w:t>
       </w:r>
       <w:r>
@@ -470,6 +471,7 @@
       <w:r>
         <w:t>:</w:t>
       </w:r>
+      <w:proofErr w:type="gramEnd"/>
       <w:r>
         <w:rPr>
           <w:spacing w:val="-8"/>
@@ -486,12 +488,10 @@
     <w:p>
       <w:pPr>
         <w:pStyle w:val="Textoindependiente"/>
-      </w:pPr>
-    </w:p>
-    <w:p>
-      <w:pPr>
-        <w:pStyle w:val="Textoindependiente"/>
         <w:spacing w:before="178"/>
+        <w:rPr>
+          <w:u w:val="single"/>
+        </w:rPr>
       </w:pPr>
     </w:p>
     <w:p>
@@ -952,7 +952,25 @@
           <w:spacing w:val="-2"/>
           <w:sz w:val="18"/>
         </w:rPr>
-        <w:t xml:space="preserve">2682-MML,Ordenanza </w:t>
+        <w:t>2682-</w:t>
+      </w:r>
+      <w:proofErr w:type="gramStart"/>
+      <w:r>
+        <w:rPr>
+          <w:rFonts w:ascii="Arial MT" w:hAnsi="Arial MT"/>
+          <w:spacing w:val="-2"/>
+          <w:sz w:val="18"/>
+        </w:rPr>
+        <w:t>MML,Ordenanza</w:t>
+      </w:r>
+      <w:proofErr w:type="gramEnd"/>
+      <w:r>
+        <w:rPr>
+          <w:rFonts w:ascii="Arial MT" w:hAnsi="Arial MT"/>
+          <w:spacing w:val="-2"/>
+          <w:sz w:val="18"/>
+        </w:rPr>
+        <w:t xml:space="preserve"> </w:t>
       </w:r>
       <w:proofErr w:type="spellStart"/>
       <w:r>
@@ -1484,7 +1502,17 @@
           <w:bCs/>
           <w:sz w:val="18"/>
         </w:rPr>
-        <w:t xml:space="preserve"> ${LICENCIA_DE_F}-${LICENCIA_ANIO}</w:t>
+        <w:t xml:space="preserve"> ${LICENCIA_DE_F}-${LICENCIA_</w:t>
+      </w:r>
+      <w:proofErr w:type="gramStart"/>
+      <w:r>
+        <w:rPr>
+          <w:rFonts w:ascii="Arial MT" w:hAnsi="Arial MT"/>
+          <w:b/>
+          <w:bCs/>
+          <w:sz w:val="18"/>
+        </w:rPr>
+        <w:t>ANIO}</w:t>
       </w:r>
       <w:r>
         <w:rPr>
@@ -1493,7 +1521,17 @@
           <w:sz w:val="20"/>
           <w:szCs w:val="20"/>
         </w:rPr>
-        <w:t>${VIGENCIA</w:t>
+        <w:t>$</w:t>
+      </w:r>
+      <w:proofErr w:type="gramEnd"/>
+      <w:r>
+        <w:rPr>
+          <w:rFonts w:ascii="Arial Narrow" w:hAnsi="Arial Narrow"/>
+          <w:b/>
+          <w:sz w:val="20"/>
+          <w:szCs w:val="20"/>
+        </w:rPr>
+        <w:t>{VIGENCIA</w:t>
       </w:r>
       <w:r>
         <w:rPr>
@@ -1554,7 +1592,7 @@
 </file>
 
 <file path=word/styles.xml><?xml version="1.0" encoding="utf-8"?>
-<w:styles xmlns:mc="http://schemas.openxmlformats.org/markup-compatibility/2006" xmlns:r="http://schemas.openxmlformats.org/officeDocument/2006/relationships" xmlns:w="http://schemas.openxmlformats.org/wordprocessingml/2006/main" xmlns:w14="http://schemas.microsoft.com/office/word/2010/wordml" xmlns:w15="http://schemas.microsoft.com/office/word/2012/wordml" xmlns:w16cex="http://schemas.microsoft.com/office/word/2018/wordml/cex" xmlns:w16cid="http://schemas.microsoft.com/office/word/2016/wordml/cid" xmlns:w16="http://schemas.microsoft.com/office/word/2018/wordml" xmlns:w16du="http://schemas.microsoft.com/office/word/2023/wordml/word16du" xmlns:w16sdtdh="http://schemas.microsoft.com/office/word/2020/wordml/sdtdatahash" xmlns:w16sdtfl="http://schemas.microsoft.com/office/word/2024/wordml/sdtformatlock" xmlns:w16se="http://schemas.microsoft.com/office/word/2015/wordml/symex" mc:Ignorable="w14 w15 w16se w16cid w16 w16cex w16sdtdh w16sdtfl w16du">
+<w:styles xmlns:mc="http://schemas.openxmlformats.org/markup-compatibility/2006" xmlns:r="http://schemas.openxmlformats.org/officeDocument/2006/relationships" xmlns:w="http://schemas.openxmlformats.org/wordprocessingml/2006/main" xmlns:w14="http://schemas.microsoft.com/office/word/2010/wordml" xmlns:w15="http://schemas.microsoft.com/office/word/2012/wordml" xmlns:w16cex="http://schemas.microsoft.com/office/word/2018/wordml/cex" xmlns:w16cid="http://schemas.microsoft.com/office/word/2016/wordml/cid" xmlns:w16="http://schemas.microsoft.com/office/word/2018/wordml" xmlns:w16sdtdh="http://schemas.microsoft.com/office/word/2020/wordml/sdtdatahash" xmlns:w16se="http://schemas.microsoft.com/office/word/2015/wordml/symex" mc:Ignorable="w14 w15 w16se w16cid w16 w16cex w16sdtdh">
   <w:docDefaults>
     <w:rPrDefault>
       <w:rPr>

</xml_diff>

<commit_message>
fix: se actualizo el word de anuncios el template
</commit_message>
<xml_diff>
--- a/app/Filament/Clusters/Sil/Resources/Anuncios/Template/template_carton_anuncio.docx
+++ b/app/Filament/Clusters/Sil/Resources/Anuncios/Template/template_carton_anuncio.docx
@@ -204,11 +204,6 @@
         </w:rPr>
         <w:t>${N_RESOLUCION}-MDLM-GDEIP-SPEA</w:t>
       </w:r>
-    </w:p>
-    <w:p>
-      <w:pPr>
-        <w:pStyle w:val="Textoindependiente"/>
-      </w:pPr>
     </w:p>
     <w:p>
       <w:pPr>
@@ -416,11 +411,6 @@
     <w:p>
       <w:pPr>
         <w:pStyle w:val="Textoindependiente"/>
-      </w:pPr>
-    </w:p>
-    <w:p>
-      <w:pPr>
-        <w:pStyle w:val="Textoindependiente"/>
         <w:spacing w:before="118"/>
       </w:pPr>
     </w:p>
@@ -457,9 +447,6 @@
       </w:r>
       <w:r>
         <w:tab/>
-      </w:r>
-      <w:proofErr w:type="gramStart"/>
-      <w:r>
         <w:t>CLASIFICACIÓN</w:t>
       </w:r>
       <w:r>
@@ -471,7 +458,6 @@
       <w:r>
         <w:t>:</w:t>
       </w:r>
-      <w:proofErr w:type="gramEnd"/>
       <w:r>
         <w:rPr>
           <w:spacing w:val="-8"/>
@@ -952,25 +938,7 @@
           <w:spacing w:val="-2"/>
           <w:sz w:val="18"/>
         </w:rPr>
-        <w:t>2682-</w:t>
-      </w:r>
-      <w:proofErr w:type="gramStart"/>
-      <w:r>
-        <w:rPr>
-          <w:rFonts w:ascii="Arial MT" w:hAnsi="Arial MT"/>
-          <w:spacing w:val="-2"/>
-          <w:sz w:val="18"/>
-        </w:rPr>
-        <w:t>MML,Ordenanza</w:t>
-      </w:r>
-      <w:proofErr w:type="gramEnd"/>
-      <w:r>
-        <w:rPr>
-          <w:rFonts w:ascii="Arial MT" w:hAnsi="Arial MT"/>
-          <w:spacing w:val="-2"/>
-          <w:sz w:val="18"/>
-        </w:rPr>
-        <w:t xml:space="preserve"> </w:t>
+        <w:t xml:space="preserve">2682-MML,Ordenanza </w:t>
       </w:r>
       <w:proofErr w:type="spellStart"/>
       <w:r>
@@ -1502,17 +1470,7 @@
           <w:bCs/>
           <w:sz w:val="18"/>
         </w:rPr>
-        <w:t xml:space="preserve"> ${LICENCIA_DE_F}-${LICENCIA_</w:t>
-      </w:r>
-      <w:proofErr w:type="gramStart"/>
-      <w:r>
-        <w:rPr>
-          <w:rFonts w:ascii="Arial MT" w:hAnsi="Arial MT"/>
-          <w:b/>
-          <w:bCs/>
-          <w:sz w:val="18"/>
-        </w:rPr>
-        <w:t>ANIO}</w:t>
+        <w:t xml:space="preserve"> ${LICENCIA_DE_F}-${LICENCIA_ANIO}</w:t>
       </w:r>
       <w:r>
         <w:rPr>
@@ -1521,17 +1479,7 @@
           <w:sz w:val="20"/>
           <w:szCs w:val="20"/>
         </w:rPr>
-        <w:t>$</w:t>
-      </w:r>
-      <w:proofErr w:type="gramEnd"/>
-      <w:r>
-        <w:rPr>
-          <w:rFonts w:ascii="Arial Narrow" w:hAnsi="Arial Narrow"/>
-          <w:b/>
-          <w:sz w:val="20"/>
-          <w:szCs w:val="20"/>
-        </w:rPr>
-        <w:t>{VIGENCIA</w:t>
+        <w:t>${VIGENCIA</w:t>
       </w:r>
       <w:r>
         <w:rPr>

</xml_diff>